<commit_message>
Docs: Close client and cloud boundaries
</commit_message>
<xml_diff>
--- a/docs/APM_对比报告.docx
+++ b/docs/APM_对比报告.docx
@@ -20,7 +20,7 @@
           <w:color w:val="52657A"/>
           <w:sz w:val="22"/>
         </w:rPr>
-        <w:t>本地源码事实快照 · 2026-07-10</w:t>
+        <w:t>本地源码事实快照 · 2026-07-11</w:t>
       </w:r>
     </w:p>
     <w:p/>
@@ -133,7 +133,7 @@
                 <w:b w:val="0"/>
                 <w:sz w:val="18"/>
               </w:rPr>
-              <w:t>24</w:t>
+              <w:t>25</w:t>
             </w:r>
           </w:p>
         </w:tc>
@@ -149,7 +149,7 @@
                 <w:b w:val="0"/>
                 <w:sz w:val="18"/>
               </w:rPr>
-              <w:t>22 个根子项目 + apm-plugin + build-logic</w:t>
+              <w:t>23 个根子项目 + apm-plugin + build-logic</w:t>
             </w:r>
           </w:p>
         </w:tc>
@@ -183,7 +183,7 @@
                 <w:b w:val="0"/>
                 <w:sz w:val="18"/>
               </w:rPr>
-              <w:t>128</w:t>
+              <w:t>141</w:t>
             </w:r>
           </w:p>
         </w:tc>
@@ -199,7 +199,7 @@
                 <w:b w:val="0"/>
                 <w:sz w:val="18"/>
               </w:rPr>
-              <w:t>123 Kotlin + 4 C + 1 proto</w:t>
+              <w:t>136 Kotlin + 4 C + 1 proto</w:t>
             </w:r>
           </w:p>
         </w:tc>
@@ -233,7 +233,7 @@
                 <w:b w:val="0"/>
                 <w:sz w:val="18"/>
               </w:rPr>
-              <w:t>63</w:t>
+              <w:t>76</w:t>
             </w:r>
           </w:p>
         </w:tc>
@@ -249,7 +249,7 @@
                 <w:b w:val="0"/>
                 <w:sz w:val="18"/>
               </w:rPr>
-              <w:t>JVM、Robolectric、插件和 native 契约测试</w:t>
+              <w:t>JVM、Robolectric、instrumented benchmark、插件和 native 契约测试</w:t>
             </w:r>
           </w:p>
         </w:tc>
@@ -383,7 +383,7 @@
                 <w:b w:val="0"/>
                 <w:sz w:val="18"/>
               </w:rPr>
-              <w:t>3c27ff9</w:t>
+              <w:t>e593aaa</w:t>
             </w:r>
           </w:p>
         </w:tc>
@@ -399,7 +399,7 @@
                 <w:b w:val="0"/>
                 <w:sz w:val="18"/>
               </w:rPr>
-              <w:t>线程治理优化后的当前实现</w:t>
+              <w:t>客户端收口后的当前实现</w:t>
             </w:r>
           </w:p>
         </w:tc>
@@ -509,7 +509,7 @@
                 <w:b w:val="0"/>
                 <w:sz w:val="18"/>
               </w:rPr>
-              <w:t>Memory、Crash、ANR、Launch、CPU、FPS、Jank、ExitReason</w:t>
+              <w:t>Memory、Crash、ANR、Launch、FPS、GC、Render、Thread</w:t>
             </w:r>
           </w:p>
         </w:tc>
@@ -559,7 +559,7 @@
                 <w:b w:val="0"/>
                 <w:sz w:val="18"/>
               </w:rPr>
-              <w:t>Network、SQLite、IPC、WebView、Battery、IO</w:t>
+              <w:t>Network、SQLite、IPC、WebView、ThreadPool、Battery、IO</w:t>
             </w:r>
           </w:p>
         </w:tc>
@@ -575,7 +575,7 @@
                 <w:b w:val="0"/>
                 <w:sz w:val="18"/>
               </w:rPr>
-              <w:t>由宿主在真实调用点传入耗时、大小或错误</w:t>
+              <w:t>由宿主在真实调用点安装 wrapper 或传入 executor/耗时/错误</w:t>
             </w:r>
           </w:p>
         </w:tc>
@@ -659,7 +659,7 @@
                 <w:b w:val="0"/>
                 <w:sz w:val="18"/>
               </w:rPr>
-              <w:t>Dispatcher → SQLite outbox → Uploader</w:t>
+              <w:t>eventId → Dispatcher → SQLite claim lease → Uploader</w:t>
             </w:r>
           </w:p>
         </w:tc>
@@ -675,7 +675,7 @@
                 <w:b w:val="0"/>
                 <w:sz w:val="18"/>
               </w:rPr>
-              <w:t>确认成功后删除，语义为至少一次</w:t>
+              <w:t>owner 确认成功后删除，语义为至少一次</w:t>
             </w:r>
           </w:p>
         </w:tc>
@@ -743,7 +743,7 @@
                 <w:b/>
                 <w:sz w:val="18"/>
               </w:rPr>
-              <w:t>未实现的预留项</w:t>
+              <w:t>不支持的全局 Hook</w:t>
             </w:r>
           </w:p>
         </w:tc>
@@ -759,7 +759,7 @@
                 <w:b w:val="0"/>
                 <w:sz w:val="18"/>
               </w:rPr>
-              <w:t>通用 Binder Hook、WebView 自动注册、线程泄漏、overdraw</w:t>
+              <w:t>Binder hidden Hook、WebView 全局接管、通用线程泄漏、GPU overdraw</w:t>
             </w:r>
           </w:p>
         </w:tc>
@@ -775,7 +775,7 @@
                 <w:b w:val="0"/>
                 <w:sz w:val="18"/>
               </w:rPr>
-              <w:t>配置字段存在不代表运行时能力存在</w:t>
+              <w:t>兼容字段已 deprecated/false；不伪装成自动能力</w:t>
             </w:r>
           </w:p>
         </w:tc>
@@ -810,7 +810,7 @@
         <w:pStyle w:val="ListBullet"/>
       </w:pPr>
       <w:r>
-        <w:t>当前语义是 acknowledged at-least-once；没有稳定事件 ID、服务端幂等键或 exactly-once 保证。</w:t>
+        <w:t>当前语义是 acknowledged at-least-once；稳定 eventId 已贯穿 wire/storage，服务端仍须幂等。</w:t>
       </w:r>
     </w:p>
     <w:p>
@@ -818,7 +818,7 @@
         <w:pStyle w:val="ListBullet"/>
       </w:pPr>
       <w:r>
-        <w:t>当前没有多消费者 claim/lease；若未来允许多个上传执行者，必须先补并发所有权协议。</w:t>
+        <w:t>SQLite 写事务提供多消费者 claim/lease/expiry、owner-aware ACK/failure 和 shutdown release。</w:t>
       </w:r>
     </w:p>
     <w:p>
@@ -1000,7 +1000,7 @@
                 <w:b w:val="0"/>
                 <w:sz w:val="18"/>
               </w:rPr>
-              <w:t>补事件 ID、服务端幂等和 outbox claim/lease，明确重放与死信</w:t>
+              <w:t>在 Collector 按客户端 eventId 幂等，明确整批 ACK、重放与死信</w:t>
             </w:r>
           </w:p>
         </w:tc>
@@ -1068,7 +1068,7 @@
                 <w:b w:val="0"/>
                 <w:sz w:val="18"/>
               </w:rPr>
-              <w:t>让配置项、文档和真实运行时能力持续一一对应</w:t>
+              <w:t>建设 Native 符号上传/后台符号化与外部制品发布</w:t>
             </w:r>
           </w:p>
         </w:tc>
@@ -1131,7 +1131,7 @@
         <w:color w:val="6B7785"/>
         <w:sz w:val="16"/>
       </w:rPr>
-      <w:t>Generated 2026-07-10 from the local AndroidAPM repository; volatile status belongs in docs/Android_APM_项目文档.md</w:t>
+      <w:t>Generated 2026-07-11 from the local AndroidAPM repository; volatile status belongs in docs/Android_APM_项目文档.md</w:t>
     </w:r>
   </w:p>
 </w:ftr>

</xml_diff>

<commit_message>
Fix: Close client monitoring gaps
</commit_message>
<xml_diff>
--- a/docs/APM_对比报告.docx
+++ b/docs/APM_对比报告.docx
@@ -183,7 +183,7 @@
                 <w:b w:val="0"/>
                 <w:sz w:val="18"/>
               </w:rPr>
-              <w:t>141</w:t>
+              <w:t>143</w:t>
             </w:r>
           </w:p>
         </w:tc>
@@ -199,7 +199,7 @@
                 <w:b w:val="0"/>
                 <w:sz w:val="18"/>
               </w:rPr>
-              <w:t>136 Kotlin + 4 C + 1 proto</w:t>
+              <w:t>138 Kotlin + 4 C + 1 proto</w:t>
             </w:r>
           </w:p>
         </w:tc>
@@ -233,7 +233,7 @@
                 <w:b w:val="0"/>
                 <w:sz w:val="18"/>
               </w:rPr>
-              <w:t>76</w:t>
+              <w:t>78</w:t>
             </w:r>
           </w:p>
         </w:tc>

</xml_diff>

<commit_message>
Docs: Sync completed integration baseline
</commit_message>
<xml_diff>
--- a/docs/APM_对比报告.docx
+++ b/docs/APM_对比报告.docx
@@ -20,7 +20,7 @@
           <w:color w:val="52657A"/>
           <w:sz w:val="22"/>
         </w:rPr>
-        <w:t>本地源码事实快照 · 2026-07-11</w:t>
+        <w:t>本地源码事实快照 · 2026-07-16</w:t>
       </w:r>
     </w:p>
     <w:p/>
@@ -183,7 +183,7 @@
                 <w:b w:val="0"/>
                 <w:sz w:val="18"/>
               </w:rPr>
-              <w:t>143</w:t>
+              <w:t>145</w:t>
             </w:r>
           </w:p>
         </w:tc>
@@ -199,7 +199,7 @@
                 <w:b w:val="0"/>
                 <w:sz w:val="18"/>
               </w:rPr>
-              <w:t>138 Kotlin + 4 C + 1 proto</w:t>
+              <w:t>140 Kotlin + 4 C + 1 proto</w:t>
             </w:r>
           </w:p>
         </w:tc>
@@ -233,7 +233,7 @@
                 <w:b w:val="0"/>
                 <w:sz w:val="18"/>
               </w:rPr>
-              <w:t>80</w:t>
+              <w:t>87</w:t>
             </w:r>
           </w:p>
         </w:tc>
@@ -383,7 +383,7 @@
                 <w:b w:val="0"/>
                 <w:sz w:val="18"/>
               </w:rPr>
-              <w:t>70a879d</w:t>
+              <w:t>4f4e803</w:t>
             </w:r>
           </w:p>
         </w:tc>
@@ -1131,7 +1131,7 @@
         <w:color w:val="6B7785"/>
         <w:sz w:val="16"/>
       </w:rPr>
-      <w:t>Generated 2026-07-11 from the local AndroidAPM repository; volatile status belongs in docs/Android_APM_项目文档.md</w:t>
+      <w:t>Generated 2026-07-16 from the local AndroidAPM repository; volatile status belongs in docs/Android_APM_项目文档.md</w:t>
     </w:r>
   </w:p>
 </w:ftr>

</xml_diff>

<commit_message>
Feat: Complete signed config on Java 17
</commit_message>
<xml_diff>
--- a/docs/APM_对比报告.docx
+++ b/docs/APM_对比报告.docx
@@ -133,7 +133,7 @@
                 <w:b w:val="0"/>
                 <w:sz w:val="18"/>
               </w:rPr>
-              <w:t>25</w:t>
+              <w:t>26</w:t>
             </w:r>
           </w:p>
         </w:tc>
@@ -149,7 +149,7 @@
                 <w:b w:val="0"/>
                 <w:sz w:val="18"/>
               </w:rPr>
-              <w:t>23 个根子项目 + apm-plugin + build-logic</w:t>
+              <w:t>24 个根子项目 + apm-plugin + build-logic</w:t>
             </w:r>
           </w:p>
         </w:tc>
@@ -183,7 +183,7 @@
                 <w:b w:val="0"/>
                 <w:sz w:val="18"/>
               </w:rPr>
-              <w:t>145</w:t>
+              <w:t>154</w:t>
             </w:r>
           </w:p>
         </w:tc>
@@ -199,7 +199,7 @@
                 <w:b w:val="0"/>
                 <w:sz w:val="18"/>
               </w:rPr>
-              <w:t>140 Kotlin + 4 C + 1 proto</w:t>
+              <w:t>149 Kotlin + 4 C + 1 proto</w:t>
             </w:r>
           </w:p>
         </w:tc>
@@ -233,7 +233,7 @@
                 <w:b w:val="0"/>
                 <w:sz w:val="18"/>
               </w:rPr>
-              <w:t>87</w:t>
+              <w:t>92</w:t>
             </w:r>
           </w:p>
         </w:tc>
@@ -333,7 +333,7 @@
                 <w:b w:val="0"/>
                 <w:sz w:val="18"/>
               </w:rPr>
-              <w:t>JDK 21 / Gradle 8.13</w:t>
+              <w:t>JDK 17 / Gradle 8.13</w:t>
             </w:r>
           </w:p>
         </w:tc>
@@ -349,7 +349,7 @@
                 <w:b w:val="0"/>
                 <w:sz w:val="18"/>
               </w:rPr>
-              <w:t>AGP 8.13.2 / Kotlin 2.2.21</w:t>
+              <w:t>AGP 8.13.2 / Kotlin 2.2.21 / Java 17 bytecode</w:t>
             </w:r>
           </w:p>
         </w:tc>
@@ -383,7 +383,7 @@
                 <w:b w:val="0"/>
                 <w:sz w:val="18"/>
               </w:rPr>
-              <w:t>4f4e803</w:t>
+              <w:t>develop（以 git log 为准）</w:t>
             </w:r>
           </w:p>
         </w:tc>
@@ -399,7 +399,7 @@
                 <w:b w:val="0"/>
                 <w:sz w:val="18"/>
               </w:rPr>
-              <w:t>客户端收口后的当前实现</w:t>
+              <w:t>以当前源码和可执行验证为准</w:t>
             </w:r>
           </w:p>
         </w:tc>

</xml_diff>

<commit_message>
Build: Adopt Java 17 toolchain best practices
</commit_message>
<xml_diff>
--- a/docs/APM_对比报告.docx
+++ b/docs/APM_对比报告.docx
@@ -333,7 +333,7 @@
                 <w:b w:val="0"/>
                 <w:sz w:val="18"/>
               </w:rPr>
-              <w:t>JDK 17 / Gradle 8.13</w:t>
+              <w:t>Java 17 toolchain / Gradle 8.13</w:t>
             </w:r>
           </w:p>
         </w:tc>
@@ -349,7 +349,7 @@
                 <w:b w:val="0"/>
                 <w:sz w:val="18"/>
               </w:rPr>
-              <w:t>AGP 8.13.2 / Kotlin 2.2.21 / Java 17 bytecode</w:t>
+              <w:t>Gradle runtime JDK 17+ / AGP 8.13.2 / Kotlin 2.2.21</w:t>
             </w:r>
           </w:p>
         </w:tc>

</xml_diff>

<commit_message>
Feat: Add aggregate SDK bundle
</commit_message>
<xml_diff>
--- a/docs/APM_对比报告.docx
+++ b/docs/APM_对比报告.docx
@@ -20,7 +20,7 @@
           <w:color w:val="52657A"/>
           <w:sz w:val="22"/>
         </w:rPr>
-        <w:t>本地源码事实快照 · 2026-07-16</w:t>
+        <w:t>本地源码事实快照 · 2026-07-22</w:t>
       </w:r>
     </w:p>
     <w:p/>
@@ -133,7 +133,7 @@
                 <w:b w:val="0"/>
                 <w:sz w:val="18"/>
               </w:rPr>
-              <w:t>26</w:t>
+              <w:t>27</w:t>
             </w:r>
           </w:p>
         </w:tc>
@@ -149,7 +149,7 @@
                 <w:b w:val="0"/>
                 <w:sz w:val="18"/>
               </w:rPr>
-              <w:t>24 个根子项目 + apm-plugin + build-logic</w:t>
+              <w:t>25 个根子项目 + apm-plugin + build-logic</w:t>
             </w:r>
           </w:p>
         </w:tc>
@@ -183,7 +183,7 @@
                 <w:b w:val="0"/>
                 <w:sz w:val="18"/>
               </w:rPr>
-              <w:t>154</w:t>
+              <w:t>157</w:t>
             </w:r>
           </w:p>
         </w:tc>
@@ -199,7 +199,7 @@
                 <w:b w:val="0"/>
                 <w:sz w:val="18"/>
               </w:rPr>
-              <w:t>149 Kotlin + 4 C + 1 proto</w:t>
+              <w:t>152 Kotlin + 4 C + 1 proto</w:t>
             </w:r>
           </w:p>
         </w:tc>
@@ -233,7 +233,7 @@
                 <w:b w:val="0"/>
                 <w:sz w:val="18"/>
               </w:rPr>
-              <w:t>92</w:t>
+              <w:t>94</w:t>
             </w:r>
           </w:p>
         </w:tc>
@@ -1131,7 +1131,7 @@
         <w:color w:val="6B7785"/>
         <w:sz w:val="16"/>
       </w:rPr>
-      <w:t>Generated 2026-07-16 from the local AndroidAPM repository; volatile status belongs in docs/Android_APM_项目文档.md</w:t>
+      <w:t>Generated 2026-07-22 from the local AndroidAPM repository; volatile status belongs in docs/Android_APM_项目文档.md</w:t>
     </w:r>
   </w:p>
 </w:ftr>

</xml_diff>

<commit_message>
Perf: Enforce benchmark release budgets
</commit_message>
<xml_diff>
--- a/docs/APM_对比报告.docx
+++ b/docs/APM_对比报告.docx
@@ -233,7 +233,7 @@
                 <w:b w:val="0"/>
                 <w:sz w:val="18"/>
               </w:rPr>
-              <w:t>94</w:t>
+              <w:t>95</w:t>
             </w:r>
           </w:p>
         </w:tc>
@@ -249,7 +249,7 @@
                 <w:b w:val="0"/>
                 <w:sz w:val="18"/>
               </w:rPr>
-              <w:t>JVM、Robolectric、instrumented benchmark、插件和 native 契约测试</w:t>
+              <w:t>JVM、Robolectric、instrumented benchmark、host budget gate、插件和 native 契约测试</w:t>
             </w:r>
           </w:p>
         </w:tc>

</xml_diff>

<commit_message>
Feat: Add strict production consent controls
</commit_message>
<xml_diff>
--- a/docs/APM_对比报告.docx
+++ b/docs/APM_对比报告.docx
@@ -183,7 +183,7 @@
                 <w:b w:val="0"/>
                 <w:sz w:val="18"/>
               </w:rPr>
-              <w:t>157</w:t>
+              <w:t>158</w:t>
             </w:r>
           </w:p>
         </w:tc>
@@ -199,7 +199,7 @@
                 <w:b w:val="0"/>
                 <w:sz w:val="18"/>
               </w:rPr>
-              <w:t>152 Kotlin + 4 C + 1 proto</w:t>
+              <w:t>153 Kotlin + 4 C + 1 proto</w:t>
             </w:r>
           </w:p>
         </w:tc>
@@ -233,7 +233,7 @@
                 <w:b w:val="0"/>
                 <w:sz w:val="18"/>
               </w:rPr>
-              <w:t>95</w:t>
+              <w:t>96</w:t>
             </w:r>
           </w:p>
         </w:tc>
@@ -476,6 +476,56 @@
                 <w:sz w:val="18"/>
               </w:rPr>
               <w:t>真实边界</w:t>
+            </w:r>
+          </w:p>
+        </w:tc>
+      </w:tr>
+      <w:tr>
+        <w:tc>
+          <w:tcPr>
+            <w:tcW w:type="dxa" w:w="3360"/>
+          </w:tcPr>
+          <w:p>
+            <w:r/>
+            <w:r>
+              <w:rPr>
+                <w:rFonts w:ascii="Arial" w:hAnsi="Arial" w:eastAsia="Microsoft YaHei"/>
+                <w:b/>
+                <w:sz w:val="18"/>
+              </w:rPr>
+              <w:t>生产安全入口</w:t>
+            </w:r>
+          </w:p>
+        </w:tc>
+        <w:tc>
+          <w:tcPr>
+            <w:tcW w:type="dxa" w:w="3360"/>
+          </w:tcPr>
+          <w:p>
+            <w:r/>
+            <w:r>
+              <w:rPr>
+                <w:rFonts w:ascii="Arial" w:hAnsi="Arial" w:eastAsia="Microsoft YaHei"/>
+                <w:b w:val="0"/>
+                <w:sz w:val="18"/>
+              </w:rPr>
+              <w:t>Strict profile、显式 consent、撤回清理</w:t>
+            </w:r>
+          </w:p>
+        </w:tc>
+        <w:tc>
+          <w:tcPr>
+            <w:tcW w:type="dxa" w:w="3360"/>
+          </w:tcPr>
+          <w:p>
+            <w:r/>
+            <w:r>
+              <w:rPr>
+                <w:rFonts w:ascii="Arial" w:hAnsi="Arial" w:eastAsia="Microsoft YaHei"/>
+                <w:b w:val="0"/>
+                <w:sz w:val="18"/>
+              </w:rPr>
+              <w:t>初始化前 fail closed；停止 delivery 后清理 queue/outbox/IPC</w:t>
             </w:r>
           </w:p>
         </w:tc>
@@ -787,6 +837,22 @@
       </w:pPr>
       <w:r>
         <w:t>数据交付语义</w:t>
+      </w:r>
+    </w:p>
+    <w:p>
+      <w:pPr>
+        <w:pStyle w:val="ListBullet"/>
+      </w:pPr>
+      <w:r>
+        <w:t>Strict production profile 在创建 SDK 资源前校验显式 consent、HTTPS/自定义 uploader、SQLite、PII 与 debug logging。</w:t>
+      </w:r>
+    </w:p>
+    <w:p>
+      <w:pPr>
+        <w:pStyle w:val="ListBullet"/>
+      </w:pPr>
+      <w:r>
+        <w:t>Consent revoke 不做优雅 drain；停止 delivery 后清理活动队列、SQLite/File outbox 与 IPC hand-off 文件。</w:t>
       </w:r>
     </w:p>
     <w:p>

</xml_diff>

<commit_message>
Feat: Add versioned collector wire protocol
</commit_message>
<xml_diff>
--- a/docs/APM_对比报告.docx
+++ b/docs/APM_对比报告.docx
@@ -183,7 +183,7 @@
                 <w:b w:val="0"/>
                 <w:sz w:val="18"/>
               </w:rPr>
-              <w:t>158</w:t>
+              <w:t>161</w:t>
             </w:r>
           </w:p>
         </w:tc>
@@ -199,7 +199,7 @@
                 <w:b w:val="0"/>
                 <w:sz w:val="18"/>
               </w:rPr>
-              <w:t>153 Kotlin + 4 C + 1 proto</w:t>
+              <w:t>156 Kotlin + 4 C + 1 proto</w:t>
             </w:r>
           </w:p>
         </w:tc>
@@ -233,7 +233,7 @@
                 <w:b w:val="0"/>
                 <w:sz w:val="18"/>
               </w:rPr>
-              <w:t>96</w:t>
+              <w:t>97</w:t>
             </w:r>
           </w:p>
         </w:tc>
@@ -526,6 +526,56 @@
                 <w:sz w:val="18"/>
               </w:rPr>
               <w:t>初始化前 fail closed；停止 delivery 后清理 queue/outbox/IPC</w:t>
+            </w:r>
+          </w:p>
+        </w:tc>
+      </w:tr>
+      <w:tr>
+        <w:tc>
+          <w:tcPr>
+            <w:tcW w:type="dxa" w:w="3360"/>
+          </w:tcPr>
+          <w:p>
+            <w:r/>
+            <w:r>
+              <w:rPr>
+                <w:rFonts w:ascii="Arial" w:hAnsi="Arial" w:eastAsia="Microsoft YaHei"/>
+                <w:b/>
+                <w:sz w:val="18"/>
+              </w:rPr>
+              <w:t>Collector Wire V2</w:t>
+            </w:r>
+          </w:p>
+        </w:tc>
+        <w:tc>
+          <w:tcPr>
+            <w:tcW w:type="dxa" w:w="3360"/>
+          </w:tcPr>
+          <w:p>
+            <w:r/>
+            <w:r>
+              <w:rPr>
+                <w:rFonts w:ascii="Arial" w:hAnsi="Arial" w:eastAsia="Microsoft YaHei"/>
+                <w:b w:val="0"/>
+                <w:sz w:val="18"/>
+              </w:rPr>
+              <w:t>Typed fields、standard resource、batch ID、size、exact ACK</w:t>
+            </w:r>
+          </w:p>
+        </w:tc>
+        <w:tc>
+          <w:tcPr>
+            <w:tcW w:type="dxa" w:w="3360"/>
+          </w:tcPr>
+          <w:p>
+            <w:r/>
+            <w:r>
+              <w:rPr>
+                <w:rFonts w:ascii="Arial" w:hAnsi="Arial" w:eastAsia="Microsoft YaHei"/>
+                <w:b w:val="0"/>
+                <w:sz w:val="18"/>
+              </w:rPr>
+              <w:t>Legacy wire 不变；V2 独立 schema 与 endpoint</w:t>
             </w:r>
           </w:p>
         </w:tc>
@@ -853,6 +903,14 @@
       </w:pPr>
       <w:r>
         <w:t>Consent revoke 不做优雅 drain；停止 delivery 后清理活动队列、SQLite/File outbox 与 IPC hand-off 文件。</w:t>
+      </w:r>
+    </w:p>
+    <w:p>
+      <w:pPr>
+        <w:pStyle w:val="ListBullet"/>
+      </w:pPr>
+      <w:r>
+        <w:t>V2 protobuf envelope 按实际编码字节拆批；2xx 只有 schema、batchId 和事件数精确 ACK 才删除 outbox。</w:t>
       </w:r>
     </w:p>
     <w:p>

</xml_diff>

<commit_message>
Feat: Add reliable critical event handoff
</commit_message>
<xml_diff>
--- a/docs/APM_对比报告.docx
+++ b/docs/APM_对比报告.docx
@@ -183,7 +183,7 @@
                 <w:b w:val="0"/>
                 <w:sz w:val="18"/>
               </w:rPr>
-              <w:t>161</w:t>
+              <w:t>162</w:t>
             </w:r>
           </w:p>
         </w:tc>
@@ -199,7 +199,7 @@
                 <w:b w:val="0"/>
                 <w:sz w:val="18"/>
               </w:rPr>
-              <w:t>156 Kotlin + 4 C + 1 proto</w:t>
+              <w:t>157 Kotlin + 4 C + 1 proto</w:t>
             </w:r>
           </w:p>
         </w:tc>
@@ -233,7 +233,7 @@
                 <w:b w:val="0"/>
                 <w:sz w:val="18"/>
               </w:rPr>
-              <w:t>97</w:t>
+              <w:t>100</w:t>
             </w:r>
           </w:p>
         </w:tc>
@@ -576,6 +576,56 @@
                 <w:sz w:val="18"/>
               </w:rPr>
               <w:t>Legacy wire 不变；V2 独立 schema 与 endpoint</w:t>
+            </w:r>
+          </w:p>
+        </w:tc>
+      </w:tr>
+      <w:tr>
+        <w:tc>
+          <w:tcPr>
+            <w:tcW w:type="dxa" w:w="3360"/>
+          </w:tcPr>
+          <w:p>
+            <w:r/>
+            <w:r>
+              <w:rPr>
+                <w:rFonts w:ascii="Arial" w:hAnsi="Arial" w:eastAsia="Microsoft YaHei"/>
+                <w:b/>
+                <w:sz w:val="18"/>
+              </w:rPr>
+              <w:t>关键事件与损失证据</w:t>
+            </w:r>
+          </w:p>
+        </w:tc>
+        <w:tc>
+          <w:tcPr>
+            <w:tcW w:type="dxa" w:w="3360"/>
+          </w:tcPr>
+          <w:p>
+            <w:r/>
+            <w:r>
+              <w:rPr>
+                <w:rFonts w:ascii="Arial" w:hAnsi="Arial" w:eastAsia="Microsoft YaHei"/>
+                <w:b w:val="0"/>
+                <w:sz w:val="18"/>
+              </w:rPr>
+              <w:t>Crash/ANR sync hand-off、drop reason/priority</w:t>
+            </w:r>
+          </w:p>
+        </w:tc>
+        <w:tc>
+          <w:tcPr>
+            <w:tcW w:type="dxa" w:w="3360"/>
+          </w:tcPr>
+          <w:p>
+            <w:r/>
+            <w:r>
+              <w:rPr>
+                <w:rFonts w:ascii="Arial" w:hAnsi="Arial" w:eastAsia="Microsoft YaHei"/>
+                <w:b w:val="0"/>
+                <w:sz w:val="18"/>
+              </w:rPr>
+              <w:t>绕过共享队列且不做网络；未知 priority 显式 unattributed</w:t>
             </w:r>
           </w:p>
         </w:tc>

</xml_diff>

<commit_message>
Fix: Use monotonic measurement clocks
</commit_message>
<xml_diff>
--- a/docs/APM_对比报告.docx
+++ b/docs/APM_对比报告.docx
@@ -183,7 +183,7 @@
                 <w:b w:val="0"/>
                 <w:sz w:val="18"/>
               </w:rPr>
-              <w:t>162</w:t>
+              <w:t>163</w:t>
             </w:r>
           </w:p>
         </w:tc>
@@ -199,7 +199,7 @@
                 <w:b w:val="0"/>
                 <w:sz w:val="18"/>
               </w:rPr>
-              <w:t>157 Kotlin + 4 C + 1 proto</w:t>
+              <w:t>158 Kotlin + 4 C + 1 proto</w:t>
             </w:r>
           </w:p>
         </w:tc>
@@ -676,6 +676,56 @@
                 <w:sz w:val="18"/>
               </w:rPr>
               <w:t>SDK 初始化后可运行；仍受权限、API 和设备限制</w:t>
+            </w:r>
+          </w:p>
+        </w:tc>
+      </w:tr>
+      <w:tr>
+        <w:tc>
+          <w:tcPr>
+            <w:tcW w:type="dxa" w:w="3360"/>
+          </w:tcPr>
+          <w:p>
+            <w:r/>
+            <w:r>
+              <w:rPr>
+                <w:rFonts w:ascii="Arial" w:hAnsi="Arial" w:eastAsia="Microsoft YaHei"/>
+                <w:b/>
+                <w:sz w:val="18"/>
+              </w:rPr>
+              <w:t>时间与快照语义</w:t>
+            </w:r>
+          </w:p>
+        </w:tc>
+        <w:tc>
+          <w:tcPr>
+            <w:tcW w:type="dxa" w:w="3360"/>
+          </w:tcPr>
+          <w:p>
+            <w:r/>
+            <w:r>
+              <w:rPr>
+                <w:rFonts w:ascii="Arial" w:hAnsi="Arial" w:eastAsia="Microsoft YaHei"/>
+                <w:b w:val="0"/>
+                <w:sz w:val="18"/>
+              </w:rPr>
+              <w:t>epoch collector 时间 + 单调 duration/window；异步事件 map 冻结</w:t>
+            </w:r>
+          </w:p>
+        </w:tc>
+        <w:tc>
+          <w:tcPr>
+            <w:tcW w:type="dxa" w:w="3360"/>
+          </w:tcPr>
+          <w:p>
+            <w:r/>
+            <w:r>
+              <w:rPr>
+                <w:rFonts w:ascii="Arial" w:hAnsi="Arial" w:eastAsia="Microsoft YaHei"/>
+                <w:b w:val="0"/>
+                <w:sz w:val="18"/>
+              </w:rPr>
+              <w:t>避免系统时间跳变和宿主后续修改污染已发生事件</w:t>
             </w:r>
           </w:p>
         </w:tc>

</xml_diff>

<commit_message>
Perf: Bound in-memory and IPC bytes
</commit_message>
<xml_diff>
--- a/docs/APM_对比报告.docx
+++ b/docs/APM_对比报告.docx
@@ -183,7 +183,7 @@
                 <w:b w:val="0"/>
                 <w:sz w:val="18"/>
               </w:rPr>
-              <w:t>163</w:t>
+              <w:t>164</w:t>
             </w:r>
           </w:p>
         </w:tc>
@@ -199,7 +199,7 @@
                 <w:b w:val="0"/>
                 <w:sz w:val="18"/>
               </w:rPr>
-              <w:t>158 Kotlin + 4 C + 1 proto</w:t>
+              <w:t>159 Kotlin + 4 C + 1 proto</w:t>
             </w:r>
           </w:p>
         </w:tc>
@@ -743,6 +743,56 @@
                 <w:b/>
                 <w:sz w:val="18"/>
               </w:rPr>
+              <w:t>跨层字节预算</w:t>
+            </w:r>
+          </w:p>
+        </w:tc>
+        <w:tc>
+          <w:tcPr>
+            <w:tcW w:type="dxa" w:w="3360"/>
+          </w:tcPr>
+          <w:p>
+            <w:r/>
+            <w:r>
+              <w:rPr>
+                <w:rFonts w:ascii="Arial" w:hAnsi="Arial" w:eastAsia="Microsoft YaHei"/>
+                <w:b w:val="0"/>
+                <w:sz w:val="18"/>
+              </w:rPr>
+              <w:t>Dispatcher 8 MiB；IPC 4 MiB/256 KiB/1 MiB/16 MiB；SQLite 256 KiB/64 MiB</w:t>
+            </w:r>
+          </w:p>
+        </w:tc>
+        <w:tc>
+          <w:tcPr>
+            <w:tcW w:type="dxa" w:w="3360"/>
+          </w:tcPr>
+          <w:p>
+            <w:r/>
+            <w:r>
+              <w:rPr>
+                <w:rFonts w:ascii="Arial" w:hAnsi="Arial" w:eastAsia="Microsoft YaHei"/>
+                <w:b w:val="0"/>
+                <w:sz w:val="18"/>
+              </w:rPr>
+              <w:t>各层按 retained estimate、encoded/file bytes、durable payload 的真实资源维度独立限界</w:t>
+            </w:r>
+          </w:p>
+        </w:tc>
+      </w:tr>
+      <w:tr>
+        <w:tc>
+          <w:tcPr>
+            <w:tcW w:type="dxa" w:w="3360"/>
+          </w:tcPr>
+          <w:p>
+            <w:r/>
+            <w:r>
+              <w:rPr>
+                <w:rFonts w:ascii="Arial" w:hAnsi="Arial" w:eastAsia="Microsoft YaHei"/>
+                <w:b/>
+                <w:sz w:val="18"/>
+              </w:rPr>
               <w:t>显式 API 接入</w:t>
             </w:r>
           </w:p>
@@ -1018,7 +1068,7 @@
         <w:pStyle w:val="ListBullet"/>
       </w:pPr>
       <w:r>
-        <w:t>内存队列有界，批处理在专用工作循环完成，避免调用方同步执行数据库写入。</w:t>
+        <w:t>Dispatcher 同时受 2048 条和 8 MiB 估算字节预算约束；IPC 与 SQLite 另按 encoded/file/durable bytes 独立限界。</w:t>
       </w:r>
     </w:p>
     <w:p>

</xml_diff>

<commit_message>
Feat: Add physical device soak gate
</commit_message>
<xml_diff>
--- a/docs/APM_对比报告.docx
+++ b/docs/APM_对比报告.docx
@@ -233,7 +233,7 @@
                 <w:b w:val="0"/>
                 <w:sz w:val="18"/>
               </w:rPr>
-              <w:t>100</w:t>
+              <w:t>102</w:t>
             </w:r>
           </w:p>
         </w:tc>
@@ -249,7 +249,7 @@
                 <w:b w:val="0"/>
                 <w:sz w:val="18"/>
               </w:rPr>
-              <w:t>JVM、Robolectric、instrumented benchmark、host budget gate、插件和 native 契约测试</w:t>
+              <w:t>JVM、Robolectric、instrumented benchmark、device-soak host gate、插件和 native 契约测试</w:t>
             </w:r>
           </w:p>
         </w:tc>
@@ -776,6 +776,56 @@
                 <w:sz w:val="18"/>
               </w:rPr>
               <w:t>各层按 retained estimate、encoded/file bytes、durable payload 的真实资源维度独立限界</w:t>
+            </w:r>
+          </w:p>
+        </w:tc>
+      </w:tr>
+      <w:tr>
+        <w:tc>
+          <w:tcPr>
+            <w:tcW w:type="dxa" w:w="3360"/>
+          </w:tcPr>
+          <w:p>
+            <w:r/>
+            <w:r>
+              <w:rPr>
+                <w:rFonts w:ascii="Arial" w:hAnsi="Arial" w:eastAsia="Microsoft YaHei"/>
+                <w:b/>
+                <w:sz w:val="18"/>
+              </w:rPr>
+              <w:t>真机开销门</w:t>
+            </w:r>
+          </w:p>
+        </w:tc>
+        <w:tc>
+          <w:tcPr>
+            <w:tcW w:type="dxa" w:w="3360"/>
+          </w:tcPr>
+          <w:p>
+            <w:r/>
+            <w:r>
+              <w:rPr>
+                <w:rFonts w:ascii="Arial" w:hAnsi="Arial" w:eastAsia="Microsoft YaHei"/>
+                <w:b w:val="0"/>
+                <w:sz w:val="18"/>
+              </w:rPr>
+              <w:t>A/B 启动、主线程、CPU、PSS、功耗、磁盘、热、离线重启</w:t>
+            </w:r>
+          </w:p>
+        </w:tc>
+        <w:tc>
+          <w:tcPr>
+            <w:tcW w:type="dxa" w:w="3360"/>
+          </w:tcPr>
+          <w:p>
+            <w:r/>
+            <w:r>
+              <w:rPr>
+                <w:rFonts w:ascii="Arial" w:hAnsi="Arial" w:eastAsia="Microsoft YaHei"/>
+                <w:b w:val="0"/>
+                <w:sz w:val="18"/>
+              </w:rPr>
+              <w:t>smoke/24h/72h 缺时长、重启、功耗或物理机证据即失败</w:t>
             </w:r>
           </w:p>
         </w:tc>

</xml_diff>

<commit_message>
Docs: Synchronize performance validation reports
</commit_message>
<xml_diff>
--- a/docs/APM_对比报告.docx
+++ b/docs/APM_对比报告.docx
@@ -20,7 +20,7 @@
           <w:color w:val="52657A"/>
           <w:sz w:val="22"/>
         </w:rPr>
-        <w:t>本地源码事实快照 · 2026-07-22</w:t>
+        <w:t>本地源码事实快照 · 2026-07-23</w:t>
       </w:r>
     </w:p>
     <w:p/>
@@ -34,7 +34,7 @@
     </w:p>
     <w:p>
       <w:r>
-        <w:t>AndroidAPM 已形成可构建、可测试的多模块 Android 客户端 APM SDK：采集事件进入有界异步管线，通过 SQLite outbox 持久化并交给可注入上传器。它仍是客户端框架，不包含生产采集后端、查询、告警和运营闭环；因此不能仅凭模块数量宣称生产完成。</w:t>
+        <w:t>AndroidAPM 已形成可构建、可测试的多模块 Android 客户端 APM SDK：采集事件进入有界异步管线，通过 SQLite outbox 持久化并交给可注入上传器。它仍是客户端框架，不包含生产采集后端、查询、告警和运营闭环。2026-07-23 的物理设备 microbenchmark 通过，但两轮 smoke CPU 均超过 20% 门禁；因此当前生产准入不通过，不能仅凭模块数量或热路径基准宣称生产完成。</w:t>
       </w:r>
     </w:p>
     <w:tbl>
@@ -825,7 +825,7 @@
                 <w:b w:val="0"/>
                 <w:sz w:val="18"/>
               </w:rPr>
-              <w:t>smoke/24h/72h 缺时长、重启、功耗或物理机证据即失败</w:t>
+              <w:t>三项 microbenchmark 通过；两轮 smoke CPU 超过 20%，24h/72h 未执行</w:t>
             </w:r>
           </w:p>
         </w:tc>
@@ -1290,6 +1290,40 @@
                 <w:b w:val="0"/>
                 <w:sz w:val="18"/>
               </w:rPr>
+              <w:t>定位并修复物理 smoke CPU 超限，按原 20% 上限重新通过后再启动 24h/72h</w:t>
+            </w:r>
+          </w:p>
+        </w:tc>
+      </w:tr>
+      <w:tr>
+        <w:tc>
+          <w:tcPr>
+            <w:tcW w:type="dxa" w:w="5040"/>
+          </w:tcPr>
+          <w:p>
+            <w:r/>
+            <w:r>
+              <w:rPr>
+                <w:rFonts w:ascii="Arial" w:hAnsi="Arial" w:eastAsia="Microsoft YaHei"/>
+                <w:b/>
+                <w:sz w:val="18"/>
+              </w:rPr>
+              <w:t>P0</w:t>
+            </w:r>
+          </w:p>
+        </w:tc>
+        <w:tc>
+          <w:tcPr>
+            <w:tcW w:type="dxa" w:w="5040"/>
+          </w:tcPr>
+          <w:p>
+            <w:r/>
+            <w:r>
+              <w:rPr>
+                <w:rFonts w:ascii="Arial" w:hAnsi="Arial" w:eastAsia="Microsoft YaHei"/>
+                <w:b w:val="0"/>
+                <w:sz w:val="18"/>
+              </w:rPr>
               <w:t>接入生产 collector，并定义鉴权、限流、协议版本和隐私治理</w:t>
             </w:r>
           </w:p>
@@ -1455,7 +1489,7 @@
         <w:color w:val="6B7785"/>
         <w:sz w:val="16"/>
       </w:rPr>
-      <w:t>Generated 2026-07-22 from the local AndroidAPM repository; volatile status belongs in docs/Android_APM_项目文档.md</w:t>
+      <w:t>Generated 2026-07-23 from the local AndroidAPM repository; volatile status belongs in docs/Android_APM_项目文档.md</w:t>
     </w:r>
   </w:p>
 </w:ftr>

</xml_diff>

<commit_message>
Perf: Avoid idle FPS VSync wakeups
</commit_message>
<xml_diff>
--- a/docs/APM_对比报告.docx
+++ b/docs/APM_对比报告.docx
@@ -34,7 +34,7 @@
     </w:p>
     <w:p>
       <w:r>
-        <w:t>AndroidAPM 已形成可构建、可测试的多模块 Android 客户端 APM SDK：采集事件进入有界异步管线，通过 SQLite outbox 持久化并交给可注入上传器。它仍是客户端框架，不包含生产采集后端、查询、告警和运营闭环。2026-07-23 的物理设备 microbenchmark 通过，但两轮 smoke CPU 均超过 20% 门禁；因此当前生产准入不通过，不能仅凭模块数量或热路径基准宣称生产完成。</w:t>
+        <w:t>AndroidAPM 已形成可构建、可测试的多模块 Android 客户端 APM SDK：采集事件进入有界异步管线，通过 SQLite outbox 持久化并交给可注入上传器。它仍是客户端框架，不包含生产采集后端、查询、告警和运营闭环。2026-07-23 的物理设备 microbenchmark 通过；FPS 静态页面 VSync observer 修复后，两轮 smoke 在原 20% 门禁下以 12.928% / 12.362% CPU 通过。短 smoke 不替代 24h/72h 长稳验收。</w:t>
       </w:r>
     </w:p>
     <w:tbl>
@@ -825,7 +825,7 @@
                 <w:b w:val="0"/>
                 <w:sz w:val="18"/>
               </w:rPr>
-              <w:t>三项 microbenchmark 通过；两轮 smoke CPU 超过 20%，24h/72h 未执行</w:t>
+              <w:t>三项 microbenchmark 通过；FPS observer 修复后两轮原预算 smoke 以 12.928% / 12.362% CPU 通过；24h/72h 未执行</w:t>
             </w:r>
           </w:p>
         </w:tc>
@@ -1274,7 +1274,7 @@
                 <w:b/>
                 <w:sz w:val="18"/>
               </w:rPr>
-              <w:t>P0</w:t>
+              <w:t>P1</w:t>
             </w:r>
           </w:p>
         </w:tc>
@@ -1290,7 +1290,7 @@
                 <w:b w:val="0"/>
                 <w:sz w:val="18"/>
               </w:rPr>
-              <w:t>定位并修复物理 smoke CPU 超限，按原 20% 上限重新通过后再启动 24h/72h</w:t>
+              <w:t>在原预算 smoke 已连续通过后，执行 24h/72h、长稳功耗、热与磁盘验收</w:t>
             </w:r>
           </w:p>
         </w:tc>

</xml_diff>

<commit_message>
Fix: Govern uploader retry threads
</commit_message>
<xml_diff>
--- a/docs/APM_对比报告.docx
+++ b/docs/APM_对比报告.docx
@@ -1155,6 +1155,14 @@
     </w:p>
     <w:p>
       <w:pPr>
+        <w:pStyle w:val="ListBullet"/>
+      </w:pPr>
+      <w:r>
+        <w:t>apm-uploader 保持底层依赖方向，同时以模块内命名工厂显式治理 worker/scheduler 的 daemon 与 MIN_PRIORITY。</w:t>
+      </w:r>
+    </w:p>
+    <w:p>
+      <w:pPr>
         <w:jc w:val="center"/>
       </w:pPr>
       <w:r>

</xml_diff>

<commit_message>
Feat: Add dispatcher stage latency evidence
</commit_message>
<xml_diff>
--- a/docs/APM_对比报告.docx
+++ b/docs/APM_对比报告.docx
@@ -1163,6 +1163,14 @@
     </w:p>
     <w:p>
       <w:pPr>
+        <w:pStyle w:val="ListBullet"/>
+      </w:pPr>
+      <w:r>
+        <w:t>Dispatcher 在 self-monitor 开启时以固定无逐样本分配直方图输出六阶段 count、平均、P95 上界和最大延迟；关闭时跳过计时，阶段证据不自动触发并行化。</w:t>
+      </w:r>
+    </w:p>
+    <w:p>
+      <w:pPr>
         <w:jc w:val="center"/>
       </w:pPr>
       <w:r>

</xml_diff>

<commit_message>
Fix: Handle OEM sample reset policies
</commit_message>
<xml_diff>
--- a/docs/APM_对比报告.docx
+++ b/docs/APM_对比报告.docx
@@ -34,7 +34,7 @@
     </w:p>
     <w:p>
       <w:r>
-        <w:t>AndroidAPM 已形成可构建、可测试的多模块 Android 客户端 APM SDK：采集事件进入有界异步管线，通过 SQLite outbox 持久化并交给可注入上传器。它仍是客户端框架，不包含生产采集后端、查询、告警和运营闭环。2026-07-23 的物理设备 microbenchmark 通过；FPS 静态页面 VSync observer 修复后，两轮 smoke 在原 20% 门禁下以 12.928% / 12.362% CPU 通过。短 smoke 不替代 24h/72h 长稳验收。</w:t>
+        <w:t>AndroidAPM 已形成可构建、可测试的多模块 Android 客户端 APM SDK：采集事件进入有界异步管线，通过 SQLite outbox 持久化并交给可注入上传器。它仍是客户端框架，不包含生产采集后端、查询、告警和运营闭环。2026-07-23 的物理设备 microbenchmark 通过；FPS 静态页面 VSync observer 修复后，两轮 smoke 在原 20% 门禁下以 12.928% / 12.362% CPU 通过；OnePlus Android 16 预检也在原预算下通过并产出 UID 功耗证据。短 smoke 不替代 24h/72h 长稳验收。</w:t>
       </w:r>
     </w:p>
     <w:tbl>
@@ -825,7 +825,7 @@
                 <w:b w:val="0"/>
                 <w:sz w:val="18"/>
               </w:rPr>
-              <w:t>三项 microbenchmark 通过；FPS observer 修复后两轮原绝对预算 smoke 以 12.928% / 12.362% CPU 通过；schema v2 新增 control/enabled/delta CPU 归因且不放宽门禁；24h/72h 未执行</w:t>
+              <w:t>三项 microbenchmark 通过；Redmi 修复后两轮原预算 smoke 通过；OnePlus Android 16 以限定包重装回退通过并产出 29.062 mAh/hour UID 功耗；24h/72h 未执行</w:t>
             </w:r>
           </w:p>
         </w:tc>

</xml_diff>

<commit_message>
Fix: Reject invalid UID power evidence
</commit_message>
<xml_diff>
--- a/docs/APM_对比报告.docx
+++ b/docs/APM_对比报告.docx
@@ -20,7 +20,7 @@
           <w:color w:val="52657A"/>
           <w:sz w:val="22"/>
         </w:rPr>
-        <w:t>本地源码事实快照 · 2026-07-23</w:t>
+        <w:t>本地源码事实快照 · 2026-07-24</w:t>
       </w:r>
     </w:p>
     <w:p/>
@@ -34,7 +34,7 @@
     </w:p>
     <w:p>
       <w:r>
-        <w:t>AndroidAPM 已形成可构建、可测试的多模块 Android 客户端 APM SDK：采集事件进入有界异步管线，通过 SQLite outbox 持久化并交给可注入上传器。它仍是客户端框架，不包含生产采集后端、查询、告警和运营闭环。2026-07-23 的物理设备 microbenchmark 通过；FPS 静态页面 VSync observer 修复后，两轮 smoke 在原 20% 门禁下以 12.928% / 12.362% CPU 通过；OnePlus Android 16 预检也在原预算下通过并产出 UID 功耗证据。短 smoke 不替代 24h/72h 长稳验收。</w:t>
+        <w:t>AndroidAPM 已形成可构建、可测试的多模块 Android 客户端 APM SDK：采集事件进入有界异步管线，通过 SQLite outbox 持久化并交给可注入上传器。它仍是客户端框架，不包含生产采集后端、查询、告警和运营闭环。2026-07-23 的物理设备 microbenchmark 通过；FPS 静态页面 VSync observer 修复后，两轮 smoke 在原 20% 门禁下以 12.928% / 12.362% CPU 通过；OnePlus Android 16 预检也在原预算下通过并产出 UID 功耗证据。2026-07-24 当前 Redmi 的 checkin UID power 五分钟后仍为零，不构成功耗接受；短 smoke 不替代 24h/72h 长稳验收。</w:t>
       </w:r>
     </w:p>
     <w:tbl>
@@ -825,7 +825,7 @@
                 <w:b w:val="0"/>
                 <w:sz w:val="18"/>
               </w:rPr>
-              <w:t>三项 microbenchmark 通过；Redmi 当前代码 smoke 以 11.319% CPU 通过但无 UID power；OnePlus Android 16 预检产出 UID 功耗，首次 24h 因持续断连失败；24h/72h 未完成</w:t>
+              <w:t>三项 microbenchmark 与 Redmi 原预算 smoke 通过；UID 功耗支持精确 checkin fallback 且要求累计值严格增长；24h/72h 未完成</w:t>
             </w:r>
           </w:p>
         </w:tc>
@@ -1171,6 +1171,14 @@
     </w:p>
     <w:p>
       <w:pPr>
+        <w:pStyle w:val="ListBullet"/>
+      </w:pPr>
+      <w:r>
+        <w:t>Device-soak UID 功耗优先读取 package-scoped 值，OEM 隐藏时精确读取 current checkin pwi；累计值必须严格增长，平坦零值、回退、坏值和错误 UID 继续 fail closed。</w:t>
+      </w:r>
+    </w:p>
+    <w:p>
+      <w:pPr>
         <w:jc w:val="center"/>
       </w:pPr>
       <w:r>
@@ -1505,7 +1513,7 @@
         <w:color w:val="6B7785"/>
         <w:sz w:val="16"/>
       </w:rPr>
-      <w:t>Generated 2026-07-23 from the local AndroidAPM repository; volatile status belongs in docs/Android_APM_项目文档.md</w:t>
+      <w:t>Generated 2026-07-24 from the local AndroidAPM repository; volatile status belongs in docs/Android_APM_项目文档.md</w:t>
     </w:r>
   </w:p>
 </w:ftr>

</xml_diff>

<commit_message>
Docs: Defer long device soak validation
</commit_message>
<xml_diff>
--- a/docs/APM_对比报告.docx
+++ b/docs/APM_对比报告.docx
@@ -20,7 +20,7 @@
           <w:color w:val="52657A"/>
           <w:sz w:val="22"/>
         </w:rPr>
-        <w:t>本地源码事实快照 · 2026-07-24</w:t>
+        <w:t>本地源码事实快照 · 2026-07-25</w:t>
       </w:r>
     </w:p>
     <w:p/>
@@ -34,7 +34,7 @@
     </w:p>
     <w:p>
       <w:r>
-        <w:t>AndroidAPM 已形成可构建、可测试的多模块 Android 客户端 APM SDK：采集事件进入有界异步管线，通过 SQLite outbox 持久化并交给可注入上传器。它仍是客户端框架，不包含生产采集后端、查询、告警和运营闭环。2026-07-23 的物理设备 microbenchmark 通过；FPS 静态页面 VSync observer 修复后，两轮 smoke 在原 20% 门禁下以 12.928% / 12.362% CPU 通过；OnePlus Android 16 预检也在原预算下通过并产出 UID 功耗证据。2026-07-24 当前 Redmi 的 checkin UID power 五分钟后仍为零，不构成功耗接受；短 smoke 不替代 24h/72h 长稳验收。</w:t>
+        <w:t>AndroidAPM 已形成可构建、可测试的多模块 Android 客户端 APM SDK：采集事件进入有界异步管线，通过 SQLite outbox 持久化并交给可注入上传器。它仍是客户端框架，不包含生产采集后端、查询、告警和运营闭环。2026-07-23 的物理设备 microbenchmark 通过；FPS 静态页面 VSync observer 修复后，两轮 smoke 在原 20% 门禁下以 12.928% / 12.362% CPU 通过；OnePlus Android 16 预检也在原预算下通过并产出 UID 功耗证据。2026-07-24 当前 Redmi 的 checkin UID power 五分钟后仍为零，不构成功耗接受。2026-07-25 的 24h 重试在完成前主动取消且无 JSON；长 profile 保留到预生产设备实验室，不阻塞当前客户端迭代。</w:t>
       </w:r>
     </w:p>
     <w:tbl>
@@ -825,7 +825,7 @@
                 <w:b w:val="0"/>
                 <w:sz w:val="18"/>
               </w:rPr>
-              <w:t>三项 microbenchmark 与 Redmi 原预算 smoke 通过；UID 功耗支持精确 checkin fallback 且要求累计值严格增长；24h/72h 未完成</w:t>
+              <w:t>三项 microbenchmark 与 Redmi 原预算 smoke 通过；24h/72h 门禁保留，延期到预生产受控设备实验室</w:t>
             </w:r>
           </w:p>
         </w:tc>
@@ -1298,40 +1298,6 @@
                 <w:b/>
                 <w:sz w:val="18"/>
               </w:rPr>
-              <w:t>P1</w:t>
-            </w:r>
-          </w:p>
-        </w:tc>
-        <w:tc>
-          <w:tcPr>
-            <w:tcW w:type="dxa" w:w="5040"/>
-          </w:tcPr>
-          <w:p>
-            <w:r/>
-            <w:r>
-              <w:rPr>
-                <w:rFonts w:ascii="Arial" w:hAnsi="Arial" w:eastAsia="Microsoft YaHei"/>
-                <w:b w:val="0"/>
-                <w:sz w:val="18"/>
-              </w:rPr>
-              <w:t>在原预算 smoke 已连续通过后，执行 24h/72h、长稳功耗、热与磁盘验收</w:t>
-            </w:r>
-          </w:p>
-        </w:tc>
-      </w:tr>
-      <w:tr>
-        <w:tc>
-          <w:tcPr>
-            <w:tcW w:type="dxa" w:w="5040"/>
-          </w:tcPr>
-          <w:p>
-            <w:r/>
-            <w:r>
-              <w:rPr>
-                <w:rFonts w:ascii="Arial" w:hAnsi="Arial" w:eastAsia="Microsoft YaHei"/>
-                <w:b/>
-                <w:sz w:val="18"/>
-              </w:rPr>
               <w:t>P0</w:t>
             </w:r>
           </w:p>
@@ -1383,6 +1349,40 @@
                 <w:sz w:val="18"/>
               </w:rPr>
               <w:t>在 Collector 按客户端 eventId 幂等，明确整批 ACK、重放与死信</w:t>
+            </w:r>
+          </w:p>
+        </w:tc>
+      </w:tr>
+      <w:tr>
+        <w:tc>
+          <w:tcPr>
+            <w:tcW w:type="dxa" w:w="5040"/>
+          </w:tcPr>
+          <w:p>
+            <w:r/>
+            <w:r>
+              <w:rPr>
+                <w:rFonts w:ascii="Arial" w:hAnsi="Arial" w:eastAsia="Microsoft YaHei"/>
+                <w:b/>
+                <w:sz w:val="18"/>
+              </w:rPr>
+              <w:t>发布前</w:t>
+            </w:r>
+          </w:p>
+        </w:tc>
+        <w:tc>
+          <w:tcPr>
+            <w:tcW w:type="dxa" w:w="5040"/>
+          </w:tcPr>
+          <w:p>
+            <w:r/>
+            <w:r>
+              <w:rPr>
+                <w:rFonts w:ascii="Arial" w:hAnsi="Arial" w:eastAsia="Microsoft YaHei"/>
+                <w:b w:val="0"/>
+                <w:sz w:val="18"/>
+              </w:rPr>
+              <w:t>在受控设备实验室按原预算执行 24h/72h、长稳功耗、热与磁盘验收</w:t>
             </w:r>
           </w:p>
         </w:tc>
@@ -1513,7 +1513,7 @@
         <w:color w:val="6B7785"/>
         <w:sz w:val="16"/>
       </w:rPr>
-      <w:t>Generated 2026-07-24 from the local AndroidAPM repository; volatile status belongs in docs/Android_APM_项目文档.md</w:t>
+      <w:t>Generated 2026-07-25 from the local AndroidAPM repository; volatile status belongs in docs/Android_APM_项目文档.md</w:t>
     </w:r>
   </w:p>
 </w:ftr>

</xml_diff>

<commit_message>
Docs: Refresh current verification baseline
</commit_message>
<xml_diff>
--- a/docs/APM_对比报告.docx
+++ b/docs/APM_对比报告.docx
@@ -20,7 +20,7 @@
           <w:color w:val="52657A"/>
           <w:sz w:val="22"/>
         </w:rPr>
-        <w:t>本地源码事实快照 · 2026-07-25</w:t>
+        <w:t>本地源码事实快照 · 2026-07-31</w:t>
       </w:r>
     </w:p>
     <w:p/>
@@ -250,6 +250,56 @@
                 <w:sz w:val="18"/>
               </w:rPr>
               <w:t>JVM、Robolectric、instrumented benchmark、device-soak host gate、插件和 native 契约测试</w:t>
+            </w:r>
+          </w:p>
+        </w:tc>
+      </w:tr>
+      <w:tr>
+        <w:tc>
+          <w:tcPr>
+            <w:tcW w:type="dxa" w:w="3360"/>
+          </w:tcPr>
+          <w:p>
+            <w:r/>
+            <w:r>
+              <w:rPr>
+                <w:rFonts w:ascii="Arial" w:hAnsi="Arial" w:eastAsia="Microsoft YaHei"/>
+                <w:b/>
+                <w:sz w:val="18"/>
+              </w:rPr>
+              <w:t>当前完整测试</w:t>
+            </w:r>
+          </w:p>
+        </w:tc>
+        <w:tc>
+          <w:tcPr>
+            <w:tcW w:type="dxa" w:w="3360"/>
+          </w:tcPr>
+          <w:p>
+            <w:r/>
+            <w:r>
+              <w:rPr>
+                <w:rFonts w:ascii="Arial" w:hAnsi="Arial" w:eastAsia="Microsoft YaHei"/>
+                <w:b w:val="0"/>
+                <w:sz w:val="18"/>
+              </w:rPr>
+              <w:t>101 suites / 688 tests</w:t>
+            </w:r>
+          </w:p>
+        </w:tc>
+        <w:tc>
+          <w:tcPr>
+            <w:tcW w:type="dxa" w:w="3360"/>
+          </w:tcPr>
+          <w:p>
+            <w:r/>
+            <w:r>
+              <w:rPr>
+                <w:rFonts w:ascii="Arial" w:hAnsi="Arial" w:eastAsia="Microsoft YaHei"/>
+                <w:b w:val="0"/>
+                <w:sz w:val="18"/>
+              </w:rPr>
+              <w:t>根 Android + model；included plugin 另有 1 suite / 18 tests，全部零失败</w:t>
             </w:r>
           </w:p>
         </w:tc>
@@ -1513,7 +1563,7 @@
         <w:color w:val="6B7785"/>
         <w:sz w:val="16"/>
       </w:rPr>
-      <w:t>Generated 2026-07-25 from the local AndroidAPM repository; volatile status belongs in docs/Android_APM_项目文档.md</w:t>
+      <w:t>Generated 2026-07-31 from the local AndroidAPM repository; volatile status belongs in docs/Android_APM_项目文档.md</w:t>
     </w:r>
   </w:p>
 </w:ftr>

</xml_diff>

<commit_message>
Build: Add public API compatibility gate
</commit_message>
<xml_diff>
--- a/docs/APM_对比报告.docx
+++ b/docs/APM_对比报告.docx
@@ -300,6 +300,56 @@
                 <w:sz w:val="18"/>
               </w:rPr>
               <w:t>根 Android + model；included plugin 另有 1 suite / 18 tests，全部零失败</w:t>
+            </w:r>
+          </w:p>
+        </w:tc>
+      </w:tr>
+      <w:tr>
+        <w:tc>
+          <w:tcPr>
+            <w:tcW w:type="dxa" w:w="3360"/>
+          </w:tcPr>
+          <w:p>
+            <w:r/>
+            <w:r>
+              <w:rPr>
+                <w:rFonts w:ascii="Arial" w:hAnsi="Arial" w:eastAsia="Microsoft YaHei"/>
+                <w:b/>
+                <w:sz w:val="18"/>
+              </w:rPr>
+              <w:t>公开 ABI 基线</w:t>
+            </w:r>
+          </w:p>
+        </w:tc>
+        <w:tc>
+          <w:tcPr>
+            <w:tcW w:type="dxa" w:w="3360"/>
+          </w:tcPr>
+          <w:p>
+            <w:r/>
+            <w:r>
+              <w:rPr>
+                <w:rFonts w:ascii="Arial" w:hAnsi="Arial" w:eastAsia="Microsoft YaHei"/>
+                <w:b w:val="0"/>
+                <w:sz w:val="18"/>
+              </w:rPr>
+              <w:t>24 个发布制品</w:t>
+            </w:r>
+          </w:p>
+        </w:tc>
+        <w:tc>
+          <w:tcPr>
+            <w:tcW w:type="dxa" w:w="3360"/>
+          </w:tcPr>
+          <w:p>
+            <w:r/>
+            <w:r>
+              <w:rPr>
+                <w:rFonts w:ascii="Arial" w:hAnsi="Arial" w:eastAsia="Microsoft YaHei"/>
+                <w:b w:val="0"/>
+                <w:sz w:val="18"/>
+              </w:rPr>
+              <w:t>23 个非空公开面；apm-bundle 无实现类并保持空基线</w:t>
             </w:r>
           </w:p>
         </w:tc>

</xml_diff>

<commit_message>
Test: Add real Collector V2 end-to-end probe
</commit_message>
<xml_diff>
--- a/docs/APM_对比报告.docx
+++ b/docs/APM_对比报告.docx
@@ -34,7 +34,7 @@
     </w:p>
     <w:p>
       <w:r>
-        <w:t>AndroidAPM 已形成可构建、可测试的多模块 Android 客户端 APM SDK：采集事件进入有界异步管线，通过 SQLite outbox 持久化并交给可注入上传器。它仍是客户端框架，不包含生产采集后端、查询、告警和运营闭环。2026-07-23 的物理设备 microbenchmark 通过；FPS 静态页面 VSync observer 修复后，两轮 smoke 在原 20% 门禁下以 12.928% / 12.362% CPU 通过；OnePlus Android 16 预检也在原预算下通过并产出 UID 功耗证据。2026-07-24 当前 Redmi 的 checkin UID power 五分钟后仍为零，不构成功耗接受。2026-07-25 的 24h 重试在完成前主动取消且无 JSON；长 profile 保留到预生产设备实验室，不阻塞当前客户端迭代。</w:t>
+        <w:t>AndroidAPM 已形成可构建、可测试的多模块 Android 客户端 APM SDK：采集事件进入有界异步管线，通过 SQLite outbox 持久化并交给可注入上传器。它仍是客户端框架，不包含生产采集后端、查询、告警和运营闭环。2026-07-23 的物理设备 microbenchmark 通过；FPS 静态页面 VSync observer 修复后，两轮 smoke 在原 20% 门禁下以 12.928% / 12.362% CPU 通过；OnePlus Android 16 预检也在原预算下通过并产出 UID 功耗证据。2026-07-31 真实 HttpApmUploader 已与独立参考服务端完成 V2/Gzip/exact ACK/typed persistence/重放去重联调；该 SQLite 兼容证据不替代 PostgreSQL/TLS/代理故障或生产部署验收。2026-07-24 当前 Redmi 的 checkin UID power 五分钟后仍为零，不构成功耗接受。2026-07-25 的 24h 重试在完成前主动取消且无 JSON；长 profile 保留到预生产设备实验室，不阻塞当前客户端迭代。</w:t>
       </w:r>
     </w:p>
     <w:tbl>
@@ -1414,7 +1414,7 @@
                 <w:b w:val="0"/>
                 <w:sz w:val="18"/>
               </w:rPr>
-              <w:t>接入生产 collector，并定义鉴权、限流、协议版本和隐私治理</w:t>
+              <w:t>把已联调的参考 Collector 部署到 PostgreSQL/TLS staging，完成鉴权、限流和隐私治理</w:t>
             </w:r>
           </w:p>
         </w:tc>
@@ -1448,7 +1448,7 @@
                 <w:b w:val="0"/>
                 <w:sz w:val="18"/>
               </w:rPr>
-              <w:t>在 Collector 按客户端 eventId 幂等，明确整批 ACK、重放与死信</w:t>
+              <w:t>验收并发 eventId 幂等、commit uncertainty、ACK 丢失、重放与死信</w:t>
             </w:r>
           </w:p>
         </w:tc>

</xml_diff>

<commit_message>
Feat: Add host integration readiness diagnostics
</commit_message>
<xml_diff>
--- a/docs/APM_对比报告.docx
+++ b/docs/APM_对比报告.docx
@@ -183,7 +183,7 @@
                 <w:b w:val="0"/>
                 <w:sz w:val="18"/>
               </w:rPr>
-              <w:t>164</w:t>
+              <w:t>165</w:t>
             </w:r>
           </w:p>
         </w:tc>
@@ -199,7 +199,7 @@
                 <w:b w:val="0"/>
                 <w:sz w:val="18"/>
               </w:rPr>
-              <w:t>159 Kotlin + 4 C + 1 proto</w:t>
+              <w:t>160 Kotlin + 4 C + 1 proto</w:t>
             </w:r>
           </w:p>
         </w:tc>
@@ -283,7 +283,7 @@
                 <w:b w:val="0"/>
                 <w:sz w:val="18"/>
               </w:rPr>
-              <w:t>101 suites / 688 tests</w:t>
+              <w:t>102 suites / 693 tests</w:t>
             </w:r>
           </w:p>
         </w:tc>
@@ -993,6 +993,56 @@
                 <w:b/>
                 <w:sz w:val="18"/>
               </w:rPr>
+              <w:t>运行时接入自检</w:t>
+            </w:r>
+          </w:p>
+        </w:tc>
+        <w:tc>
+          <w:tcPr>
+            <w:tcW w:type="dxa" w:w="3360"/>
+          </w:tcPr>
+          <w:p>
+            <w:r/>
+            <w:r>
+              <w:rPr>
+                <w:rFonts w:ascii="Arial" w:hAnsi="Arial" w:eastAsia="Microsoft YaHei"/>
+                <w:b w:val="0"/>
+                <w:sz w:val="18"/>
+              </w:rPr>
+              <w:t>hostIntegrationSnapshot 模块/注册/调用证据</w:t>
+            </w:r>
+          </w:p>
+        </w:tc>
+        <w:tc>
+          <w:tcPr>
+            <w:tcW w:type="dxa" w:w="3360"/>
+          </w:tcPr>
+          <w:p>
+            <w:r/>
+            <w:r>
+              <w:rPr>
+                <w:rFonts w:ascii="Arial" w:hAnsi="Arial" w:eastAsia="Microsoft YaHei"/>
+                <w:b w:val="0"/>
+                <w:sz w:val="18"/>
+              </w:rPr>
+              <w:t>只存枚举、计数、时间戳；无流量不能被误判为静态接入失败</w:t>
+            </w:r>
+          </w:p>
+        </w:tc>
+      </w:tr>
+      <w:tr>
+        <w:tc>
+          <w:tcPr>
+            <w:tcW w:type="dxa" w:w="3360"/>
+          </w:tcPr>
+          <w:p>
+            <w:r/>
+            <w:r>
+              <w:rPr>
+                <w:rFonts w:ascii="Arial" w:hAnsi="Arial" w:eastAsia="Microsoft YaHei"/>
+                <w:b/>
+                <w:sz w:val="18"/>
+              </w:rPr>
               <w:t>构建期插桩</w:t>
             </w:r>
           </w:p>
@@ -1267,6 +1317,14 @@
       </w:pPr>
       <w:r>
         <w:t>Dispatcher 在 self-monitor 开启时以固定无逐样本分配直方图输出六阶段 count、平均、P95 上界和最大延迟；关闭时跳过计时，阶段证据不自动触发并行化。</w:t>
+      </w:r>
+    </w:p>
+    <w:p>
+      <w:pPr>
+        <w:pStyle w:val="ListBullet"/>
+      </w:pPr>
+      <w:r>
+        <w:t>ApmDiagnostics 以固定大小、无宿主值的 hostIntegrationSnapshot 区分模块运行、当前 registration 与会话内调用证据；NO_RUNTIME_EVIDENCE 只表示本会话尚未发生相应流程。</w:t>
       </w:r>
     </w:p>
     <w:p>

</xml_diff>

<commit_message>
Fix: Preserve critical handoff durability
</commit_message>
<xml_diff>
--- a/docs/APM_对比报告.docx
+++ b/docs/APM_对比报告.docx
@@ -233,7 +233,7 @@
                 <w:b w:val="0"/>
                 <w:sz w:val="18"/>
               </w:rPr>
-              <w:t>102</w:t>
+              <w:t>104</w:t>
             </w:r>
           </w:p>
         </w:tc>
@@ -283,7 +283,7 @@
                 <w:b w:val="0"/>
                 <w:sz w:val="18"/>
               </w:rPr>
-              <w:t>102 suites / 693 tests</w:t>
+              <w:t>103 suites / 700 tests</w:t>
             </w:r>
           </w:p>
         </w:tc>
@@ -725,7 +725,7 @@
                 <w:b w:val="0"/>
                 <w:sz w:val="18"/>
               </w:rPr>
-              <w:t>绕过共享队列且不做网络；未知 priority 显式 unattributed</w:t>
+              <w:t>CRITICAL IPC 仅在同步存储接受后删除；失败保留重试且宿主 crash handler 始终委托</w:t>
             </w:r>
           </w:p>
         </w:tc>

</xml_diff>

<commit_message>
Test: Add managed device lab matrix
</commit_message>
<xml_diff>
--- a/docs/APM_对比报告.docx
+++ b/docs/APM_对比报告.docx
@@ -34,7 +34,7 @@
     </w:p>
     <w:p>
       <w:r>
-        <w:t>AndroidAPM 已形成可构建、可测试的多模块 Android 客户端 APM SDK：采集事件进入有界异步管线，通过 SQLite outbox 持久化并交给可注入上传器。它仍是客户端框架，不包含生产采集后端、查询、告警和运营闭环。2026-07-23 的物理设备 microbenchmark 通过；FPS 静态页面 VSync observer 修复后，两轮 smoke 在原 20% 门禁下以 12.928% / 12.362% CPU 通过；OnePlus Android 16 预检也在原预算下通过并产出 UID 功耗证据。2026-07-31 真实 HttpApmUploader 已与独立参考服务端完成 V2/Gzip/exact ACK/typed persistence/重放去重联调；该 SQLite 兼容证据不替代 PostgreSQL/TLS/代理故障或生产部署验收。2026-07-24 当前 Redmi 的 checkin UID power 五分钟后仍为零，不构成功耗接受。2026-07-25 的 24h 重试在完成前主动取消且无 JSON；长 profile 保留到预生产设备实验室，不阻塞当前客户端迭代。</w:t>
+        <w:t>AndroidAPM 已形成可构建、可测试的多模块 Android 客户端 APM SDK：采集事件进入有界异步管线，通过 SQLite outbox 持久化并交给可注入上传器。它仍是客户端框架，不包含生产采集后端、查询、告警和运营闭环。2026-07-23 的物理设备 microbenchmark 通过；FPS 静态页面 VSync observer 修复后，两轮 smoke 在原 20% 门禁下以 12.928% / 12.362% CPU 通过；OnePlus Android 16 预检也在原预算下通过并产出 UID 功耗证据。2026-07-31 真实 HttpApmUploader 已与独立参考服务端完成 V2/Gzip/exact ACK/typed persistence/重放去重联调；该 SQLite 兼容证据不替代 PostgreSQL/TLS/代理故障或生产部署验收。2026-07-24 当前 Redmi 的 checkin UID power 五分钟后仍为零，不构成功耗接受。2026-07-25 的 24h 重试在完成前主动取消且无 JSON；长 profile 保留到预生产设备实验室，不阻塞当前客户端迭代。2026-07-31 已固化 API 24–28 / 29–33 / 34–36 三 lane、六组 profile 工件与 exact provenance 汇总门禁；plan-only 通过不代表真机长稳通过。</w:t>
       </w:r>
     </w:p>
     <w:tbl>
@@ -233,7 +233,7 @@
                 <w:b w:val="0"/>
                 <w:sz w:val="18"/>
               </w:rPr>
-              <w:t>104</w:t>
+              <w:t>105</w:t>
             </w:r>
           </w:p>
         </w:tc>
@@ -249,7 +249,7 @@
                 <w:b w:val="0"/>
                 <w:sz w:val="18"/>
               </w:rPr>
-              <w:t>JVM、Robolectric、instrumented benchmark、device-soak host gate、插件和 native 契约测试</w:t>
+              <w:t>JVM、Robolectric、instrumented benchmark、device-soak/device-lab host gate、插件和 native 契约测试</w:t>
             </w:r>
           </w:p>
         </w:tc>
@@ -925,7 +925,7 @@
                 <w:b w:val="0"/>
                 <w:sz w:val="18"/>
               </w:rPr>
-              <w:t>三项 microbenchmark 与 Redmi 原预算 smoke 通过；24h/72h 门禁保留，延期到预生产受控设备实验室</w:t>
+              <w:t>三项 microbenchmark 与 Redmi 原预算 smoke 通过；三 lane/六工件矩阵及 provenance 门禁已固化，24h/72h 真机执行延期到预生产设备实验室</w:t>
             </w:r>
           </w:p>
         </w:tc>
@@ -1337,6 +1337,14 @@
     </w:p>
     <w:p>
       <w:pPr>
+        <w:pStyle w:val="ListBullet"/>
+      </w:pPr>
+      <w:r>
+        <w:t>Device-soak schema v3 绑定 APK、clean source、matrix/budget/runner 哈希、lane 与完整设备身份；aggregate gate 要求同一 APK/source、全部 lane/profile 以及 OEM/设备/reset 多样性。</w:t>
+      </w:r>
+    </w:p>
+    <w:p>
+      <w:pPr>
         <w:jc w:val="center"/>
       </w:pPr>
       <w:r>
@@ -1574,7 +1582,7 @@
                 <w:b w:val="0"/>
                 <w:sz w:val="18"/>
               </w:rPr>
-              <w:t>建立真机/OEM/API 设备矩阵，覆盖 native、ANR、多进程和长期离线</w:t>
+              <w:t>按已固化的真机/OEM/API 矩阵执行 native、ANR、多进程和长期离线实测</w:t>
             </w:r>
           </w:p>
         </w:tc>

</xml_diff>

<commit_message>
Build: Add release supply chain gate
</commit_message>
<xml_diff>
--- a/docs/APM_对比报告.docx
+++ b/docs/APM_对比报告.docx
@@ -233,7 +233,7 @@
                 <w:b w:val="0"/>
                 <w:sz w:val="18"/>
               </w:rPr>
-              <w:t>105</w:t>
+              <w:t>106</w:t>
             </w:r>
           </w:p>
         </w:tc>
@@ -249,7 +249,7 @@
                 <w:b w:val="0"/>
                 <w:sz w:val="18"/>
               </w:rPr>
-              <w:t>JVM、Robolectric、instrumented benchmark、device-soak/device-lab host gate、插件和 native 契约测试</w:t>
+              <w:t>JVM、Robolectric、发布候选、instrumented benchmark、device-soak/device-lab host gate、插件和 native 契约测试</w:t>
             </w:r>
           </w:p>
         </w:tc>
@@ -1345,6 +1345,14 @@
     </w:p>
     <w:p>
       <w:pPr>
+        <w:pStyle w:val="ListBullet"/>
+      </w:pPr>
+      <w:r>
+        <w:t>发布候选门禁校验 25 个 Maven 坐标、Bundle/Gradle 插件依赖图、Java 17 字节码与 ZIP 安全，生成逐文件 SHA-256 manifest 和 SPDX SBOM；真实外部 staging/promotion 仍需平台凭据。</w:t>
+      </w:r>
+    </w:p>
+    <w:p>
+      <w:pPr>
         <w:jc w:val="center"/>
       </w:pPr>
       <w:r>
@@ -1616,7 +1624,7 @@
                 <w:b w:val="0"/>
                 <w:sz w:val="18"/>
               </w:rPr>
-              <w:t>建设 Native 符号上传/后台符号化与外部制品发布</w:t>
+              <w:t>建设 Native 符号上传/后台符号化；用平台凭据完成外部 Maven staging/promotion</w:t>
             </w:r>
           </w:p>
         </w:tc>

</xml_diff>

<commit_message>
Perf: Harden dispatcher admission path
</commit_message>
<xml_diff>
--- a/docs/APM_对比报告.docx
+++ b/docs/APM_对比报告.docx
@@ -233,7 +233,7 @@
                 <w:b w:val="0"/>
                 <w:sz w:val="18"/>
               </w:rPr>
-              <w:t>106</w:t>
+              <w:t>107</w:t>
             </w:r>
           </w:p>
         </w:tc>
@@ -283,7 +283,7 @@
                 <w:b w:val="0"/>
                 <w:sz w:val="18"/>
               </w:rPr>
-              <w:t>103 suites / 700 tests</w:t>
+              <w:t>103 suites / 701 tests</w:t>
             </w:r>
           </w:p>
         </w:tc>
@@ -925,7 +925,7 @@
                 <w:b w:val="0"/>
                 <w:sz w:val="18"/>
               </w:rPr>
-              <w:t>三项 microbenchmark 与 Redmi 原预算 smoke 通过；三 lane/六工件矩阵及 provenance 门禁已固化，24h/72h 真机执行延期到预生产设备实验室</w:t>
+              <w:t>历史三项 microbenchmark 与 Redmi 原预算 smoke 通过；现行五项 gate 新增 Dispatcher 常态/满队列准入且待真机执行，三 lane/六工件矩阵及 provenance 门禁已固化</w:t>
             </w:r>
           </w:p>
         </w:tc>
@@ -1316,7 +1316,7 @@
         <w:pStyle w:val="ListBullet"/>
       </w:pPr>
       <w:r>
-        <w:t>Dispatcher 在 self-monitor 开启时以固定无逐样本分配直方图输出六阶段 count、平均、P95 上界和最大延迟；关闭时跳过计时，阶段证据不自动触发并行化。</w:t>
+        <w:t>Dispatcher 在 self-monitor 开启时以固定无逐样本分配直方图输出六阶段 count、平均、P95 上界和最大延迟；满队列高优先级替换按固定优先级 FIFO 扫描而不再复制排序全队列，AndroidX gate 新增常态与满队列准入；关闭时跳过计时，阶段证据不自动触发并行化。</w:t>
       </w:r>
     </w:p>
     <w:p>

</xml_diff>

<commit_message>
Security: Harden untrusted telemetry inputs
</commit_message>
<xml_diff>
--- a/docs/APM_对比报告.docx
+++ b/docs/APM_对比报告.docx
@@ -283,7 +283,7 @@
                 <w:b w:val="0"/>
                 <w:sz w:val="18"/>
               </w:rPr>
-              <w:t>103 suites / 701 tests</w:t>
+              <w:t>103 suites / 714 tests</w:t>
             </w:r>
           </w:p>
         </w:tc>
@@ -1143,6 +1143,56 @@
                 <w:b/>
                 <w:sz w:val="18"/>
               </w:rPr>
+              <w:t>安全输入边界</w:t>
+            </w:r>
+          </w:p>
+        </w:tc>
+        <w:tc>
+          <w:tcPr>
+            <w:tcW w:type="dxa" w:w="3360"/>
+          </w:tcPr>
+          <w:p>
+            <w:r/>
+            <w:r>
+              <w:rPr>
+                <w:rFonts w:ascii="Arial" w:hAnsi="Arial" w:eastAsia="Microsoft YaHei"/>
+                <w:b w:val="0"/>
+                <w:sz w:val="18"/>
+              </w:rPr>
+              <w:t>Strict JSON/Ed25519、durable UTF-8、canonical ACK、PII fixed corpus</w:t>
+            </w:r>
+          </w:p>
+        </w:tc>
+        <w:tc>
+          <w:tcPr>
+            <w:tcW w:type="dxa" w:w="3360"/>
+          </w:tcPr>
+          <w:p>
+            <w:r/>
+            <w:r>
+              <w:rPr>
+                <w:rFonts w:ascii="Arial" w:hAnsi="Arial" w:eastAsia="Microsoft YaHei"/>
+                <w:b w:val="0"/>
+                <w:sz w:val="18"/>
+              </w:rPr>
+              <w:t>固定种子回归覆盖截断/位翻转/深层与重复 key/字段名变体；不冒充持续 fuzz 或渗透测试</w:t>
+            </w:r>
+          </w:p>
+        </w:tc>
+      </w:tr>
+      <w:tr>
+        <w:tc>
+          <w:tcPr>
+            <w:tcW w:type="dxa" w:w="3360"/>
+          </w:tcPr>
+          <w:p>
+            <w:r/>
+            <w:r>
+              <w:rPr>
+                <w:rFonts w:ascii="Arial" w:hAnsi="Arial" w:eastAsia="Microsoft YaHei"/>
+                <w:b/>
+                <w:sz w:val="18"/>
+              </w:rPr>
               <w:t>扩展</w:t>
             </w:r>
           </w:p>
@@ -1301,6 +1351,14 @@
       </w:pPr>
       <w:r>
         <w:t>持久化 codec v3 为常用标量写类型标签并兼容读取 v1/v2；任意对象仍安全降级为字符串。</w:t>
+      </w:r>
+    </w:p>
+    <w:p>
+      <w:pPr>
+        <w:pStyle w:val="ListBullet"/>
+      </w:pPr>
+      <w:r>
+        <w:t>安全边界在分配、递归和验签前生效：durable 拒绝非法 UTF-8、截断和尾随字节，remote-config 限制 bytes/depth/nodes 并拒绝重复 key，V2 ACK 仅接受规范正十进制；固定种子语料覆盖协议与 PII 变体，但不替代生产渗透测试。</w:t>
       </w:r>
     </w:p>
     <w:p>

</xml_diff>